<commit_message>
Évaluation 1 : retirer la facilité d'en changer et la pérennité
- Énoncé : le tableau de comparaison porte sur ce que l'outil fait, le
  modèle de prix, le coût sur trois ans et le temps d'apprentissage
- Gabarit Word : lignes « Facilité d'en changer plus tard » et « Chances
  qu'il existe encore dans 5 ans » retirées des cinq tableaux

Co-Authored-By: Claude Opus 5.5 <noreply@anthropic.com>
</commit_message>
<xml_diff>
--- a/docs/public/fiches/eval1-gabarit-rapport.docx
+++ b/docs/public/fiches/eval1-gabarit-rapport.docx
@@ -2015,78 +2015,6 @@
           </w:tcPr>
           <w:p>
             <w:r>
-              <w:t>Facilité d'en changer plus tard</w:t>
-            </w:r>
-          </w:p>
-        </w:tc>
-        <w:tc>
-          <w:tcPr>
-            <w:tcW w:type="dxa" w:w="2448"/>
-          </w:tcPr>
-          <w:p>
-            <w:r/>
-          </w:p>
-        </w:tc>
-        <w:tc>
-          <w:tcPr>
-            <w:tcW w:type="dxa" w:w="2448"/>
-          </w:tcPr>
-          <w:p>
-            <w:r/>
-          </w:p>
-        </w:tc>
-        <w:tc>
-          <w:tcPr>
-            <w:tcW w:type="dxa" w:w="2448"/>
-          </w:tcPr>
-          <w:p>
-            <w:r/>
-          </w:p>
-        </w:tc>
-      </w:tr>
-      <w:tr>
-        <w:tc>
-          <w:tcPr>
-            <w:tcW w:type="dxa" w:w="2736"/>
-          </w:tcPr>
-          <w:p>
-            <w:r>
-              <w:t>Chances qu'il existe encore dans 5 ans</w:t>
-            </w:r>
-          </w:p>
-        </w:tc>
-        <w:tc>
-          <w:tcPr>
-            <w:tcW w:type="dxa" w:w="2448"/>
-          </w:tcPr>
-          <w:p>
-            <w:r/>
-          </w:p>
-        </w:tc>
-        <w:tc>
-          <w:tcPr>
-            <w:tcW w:type="dxa" w:w="2448"/>
-          </w:tcPr>
-          <w:p>
-            <w:r/>
-          </w:p>
-        </w:tc>
-        <w:tc>
-          <w:tcPr>
-            <w:tcW w:type="dxa" w:w="2448"/>
-          </w:tcPr>
-          <w:p>
-            <w:r/>
-          </w:p>
-        </w:tc>
-      </w:tr>
-      <w:tr>
-        <w:tc>
-          <w:tcPr>
-            <w:tcW w:type="dxa" w:w="2736"/>
-          </w:tcPr>
-          <w:p>
-            <w:r>
               <w:t>Source(s) ou essai</w:t>
             </w:r>
           </w:p>
@@ -2410,78 +2338,6 @@
           </w:tcPr>
           <w:p>
             <w:r>
-              <w:t>Facilité d'en changer plus tard</w:t>
-            </w:r>
-          </w:p>
-        </w:tc>
-        <w:tc>
-          <w:tcPr>
-            <w:tcW w:type="dxa" w:w="2448"/>
-          </w:tcPr>
-          <w:p>
-            <w:r/>
-          </w:p>
-        </w:tc>
-        <w:tc>
-          <w:tcPr>
-            <w:tcW w:type="dxa" w:w="2448"/>
-          </w:tcPr>
-          <w:p>
-            <w:r/>
-          </w:p>
-        </w:tc>
-        <w:tc>
-          <w:tcPr>
-            <w:tcW w:type="dxa" w:w="2448"/>
-          </w:tcPr>
-          <w:p>
-            <w:r/>
-          </w:p>
-        </w:tc>
-      </w:tr>
-      <w:tr>
-        <w:tc>
-          <w:tcPr>
-            <w:tcW w:type="dxa" w:w="2736"/>
-          </w:tcPr>
-          <w:p>
-            <w:r>
-              <w:t>Chances qu'il existe encore dans 5 ans</w:t>
-            </w:r>
-          </w:p>
-        </w:tc>
-        <w:tc>
-          <w:tcPr>
-            <w:tcW w:type="dxa" w:w="2448"/>
-          </w:tcPr>
-          <w:p>
-            <w:r/>
-          </w:p>
-        </w:tc>
-        <w:tc>
-          <w:tcPr>
-            <w:tcW w:type="dxa" w:w="2448"/>
-          </w:tcPr>
-          <w:p>
-            <w:r/>
-          </w:p>
-        </w:tc>
-        <w:tc>
-          <w:tcPr>
-            <w:tcW w:type="dxa" w:w="2448"/>
-          </w:tcPr>
-          <w:p>
-            <w:r/>
-          </w:p>
-        </w:tc>
-      </w:tr>
-      <w:tr>
-        <w:tc>
-          <w:tcPr>
-            <w:tcW w:type="dxa" w:w="2736"/>
-          </w:tcPr>
-          <w:p>
-            <w:r>
               <w:t>Source(s) ou essai</w:t>
             </w:r>
           </w:p>
@@ -2805,78 +2661,6 @@
           </w:tcPr>
           <w:p>
             <w:r>
-              <w:t>Facilité d'en changer plus tard</w:t>
-            </w:r>
-          </w:p>
-        </w:tc>
-        <w:tc>
-          <w:tcPr>
-            <w:tcW w:type="dxa" w:w="2448"/>
-          </w:tcPr>
-          <w:p>
-            <w:r/>
-          </w:p>
-        </w:tc>
-        <w:tc>
-          <w:tcPr>
-            <w:tcW w:type="dxa" w:w="2448"/>
-          </w:tcPr>
-          <w:p>
-            <w:r/>
-          </w:p>
-        </w:tc>
-        <w:tc>
-          <w:tcPr>
-            <w:tcW w:type="dxa" w:w="2448"/>
-          </w:tcPr>
-          <w:p>
-            <w:r/>
-          </w:p>
-        </w:tc>
-      </w:tr>
-      <w:tr>
-        <w:tc>
-          <w:tcPr>
-            <w:tcW w:type="dxa" w:w="2736"/>
-          </w:tcPr>
-          <w:p>
-            <w:r>
-              <w:t>Chances qu'il existe encore dans 5 ans</w:t>
-            </w:r>
-          </w:p>
-        </w:tc>
-        <w:tc>
-          <w:tcPr>
-            <w:tcW w:type="dxa" w:w="2448"/>
-          </w:tcPr>
-          <w:p>
-            <w:r/>
-          </w:p>
-        </w:tc>
-        <w:tc>
-          <w:tcPr>
-            <w:tcW w:type="dxa" w:w="2448"/>
-          </w:tcPr>
-          <w:p>
-            <w:r/>
-          </w:p>
-        </w:tc>
-        <w:tc>
-          <w:tcPr>
-            <w:tcW w:type="dxa" w:w="2448"/>
-          </w:tcPr>
-          <w:p>
-            <w:r/>
-          </w:p>
-        </w:tc>
-      </w:tr>
-      <w:tr>
-        <w:tc>
-          <w:tcPr>
-            <w:tcW w:type="dxa" w:w="2736"/>
-          </w:tcPr>
-          <w:p>
-            <w:r>
               <w:t>Source(s) ou essai</w:t>
             </w:r>
           </w:p>
@@ -3200,78 +2984,6 @@
           </w:tcPr>
           <w:p>
             <w:r>
-              <w:t>Facilité d'en changer plus tard</w:t>
-            </w:r>
-          </w:p>
-        </w:tc>
-        <w:tc>
-          <w:tcPr>
-            <w:tcW w:type="dxa" w:w="2448"/>
-          </w:tcPr>
-          <w:p>
-            <w:r/>
-          </w:p>
-        </w:tc>
-        <w:tc>
-          <w:tcPr>
-            <w:tcW w:type="dxa" w:w="2448"/>
-          </w:tcPr>
-          <w:p>
-            <w:r/>
-          </w:p>
-        </w:tc>
-        <w:tc>
-          <w:tcPr>
-            <w:tcW w:type="dxa" w:w="2448"/>
-          </w:tcPr>
-          <w:p>
-            <w:r/>
-          </w:p>
-        </w:tc>
-      </w:tr>
-      <w:tr>
-        <w:tc>
-          <w:tcPr>
-            <w:tcW w:type="dxa" w:w="2736"/>
-          </w:tcPr>
-          <w:p>
-            <w:r>
-              <w:t>Chances qu'il existe encore dans 5 ans</w:t>
-            </w:r>
-          </w:p>
-        </w:tc>
-        <w:tc>
-          <w:tcPr>
-            <w:tcW w:type="dxa" w:w="2448"/>
-          </w:tcPr>
-          <w:p>
-            <w:r/>
-          </w:p>
-        </w:tc>
-        <w:tc>
-          <w:tcPr>
-            <w:tcW w:type="dxa" w:w="2448"/>
-          </w:tcPr>
-          <w:p>
-            <w:r/>
-          </w:p>
-        </w:tc>
-        <w:tc>
-          <w:tcPr>
-            <w:tcW w:type="dxa" w:w="2448"/>
-          </w:tcPr>
-          <w:p>
-            <w:r/>
-          </w:p>
-        </w:tc>
-      </w:tr>
-      <w:tr>
-        <w:tc>
-          <w:tcPr>
-            <w:tcW w:type="dxa" w:w="2736"/>
-          </w:tcPr>
-          <w:p>
-            <w:r>
               <w:t>Source(s) ou essai</w:t>
             </w:r>
           </w:p>
@@ -3560,78 +3272,6 @@
           <w:p>
             <w:r>
               <w:t>Temps pour apprendre à s'en servir</w:t>
-            </w:r>
-          </w:p>
-        </w:tc>
-        <w:tc>
-          <w:tcPr>
-            <w:tcW w:type="dxa" w:w="2448"/>
-          </w:tcPr>
-          <w:p>
-            <w:r/>
-          </w:p>
-        </w:tc>
-        <w:tc>
-          <w:tcPr>
-            <w:tcW w:type="dxa" w:w="2448"/>
-          </w:tcPr>
-          <w:p>
-            <w:r/>
-          </w:p>
-        </w:tc>
-        <w:tc>
-          <w:tcPr>
-            <w:tcW w:type="dxa" w:w="2448"/>
-          </w:tcPr>
-          <w:p>
-            <w:r/>
-          </w:p>
-        </w:tc>
-      </w:tr>
-      <w:tr>
-        <w:tc>
-          <w:tcPr>
-            <w:tcW w:type="dxa" w:w="2736"/>
-          </w:tcPr>
-          <w:p>
-            <w:r>
-              <w:t>Facilité d'en changer plus tard</w:t>
-            </w:r>
-          </w:p>
-        </w:tc>
-        <w:tc>
-          <w:tcPr>
-            <w:tcW w:type="dxa" w:w="2448"/>
-          </w:tcPr>
-          <w:p>
-            <w:r/>
-          </w:p>
-        </w:tc>
-        <w:tc>
-          <w:tcPr>
-            <w:tcW w:type="dxa" w:w="2448"/>
-          </w:tcPr>
-          <w:p>
-            <w:r/>
-          </w:p>
-        </w:tc>
-        <w:tc>
-          <w:tcPr>
-            <w:tcW w:type="dxa" w:w="2448"/>
-          </w:tcPr>
-          <w:p>
-            <w:r/>
-          </w:p>
-        </w:tc>
-      </w:tr>
-      <w:tr>
-        <w:tc>
-          <w:tcPr>
-            <w:tcW w:type="dxa" w:w="2736"/>
-          </w:tcPr>
-          <w:p>
-            <w:r>
-              <w:t>Chances qu'il existe encore dans 5 ans</w:t>
             </w:r>
           </w:p>
         </w:tc>

</xml_diff>

<commit_message>
Gabarit de l'évaluation 1 : séparer la question en profondeur et le survol
La section 6 devient « 6.1 Notre question, en profondeur » et « 6.2 Les
quatre autres questions, en survol », avec un bandeau pour chacune et un
tableau court de deux outils pour le survol, aligné sur l'énoncé.
Séance 5 et Lab 05 renvoient à la nouvelle structure.

Co-Authored-By: Claude Opus 5.5 <noreply@anthropic.com>
</commit_message>
<xml_diff>
--- a/docs/public/fiches/eval1-gabarit-rapport.docx
+++ b/docs/public/fiches/eval1-gabarit-rapport.docx
@@ -1728,7 +1728,7 @@
         <w:pStyle w:val="Heading1"/>
       </w:pPr>
       <w:r>
-        <w:t>6. Les possibilités techniques</w:t>
+        <w:t xml:space="preserve">6. Les possibilités techniques</w:t>
       </w:r>
     </w:p>
     <w:p>
@@ -1737,7 +1737,7 @@
           <w:i/>
           <w:color w:val="56616C"/>
         </w:rPr>
-        <w:t>Pour chacune des cinq questions : le besoin, les familles de solutions, deux ou trois outils comparés sur les mêmes critères, leurs avantages et leurs limites pour ce client, et ce qui reste à vérifier. La question de votre équipe est traitée en profondeur : deux ou trois outils, toutes les lignes du tableau, résultats de vos essais (détail en annexe A). Les quatre autres sont traitées en survol, à partir de votre propre recherche : deux outils, et seulement les lignes « Ce qu'il fait », « Modèle de prix », « Coût estimé sur 3 ans » et « Source(s) »; supprimez les autres lignes et la colonne Outil 3. Décrivez, ne recommandez pas.</w:t>
+        <w:t xml:space="preserve">Les cinq questions : Q1 — Réserver et payer en ligne · Q2 — Faire signer la décharge avant l'arrivée · Q3 — La plateforme du site · Q4 — Montrer les vidéos sans ralentir le site · Q5 — Offrir le site en français et en anglais. Votre question est traitée en profondeur (6.1). Les quatre autres sont traitées en survol (6.2) : une partie beaucoup plus courte. Décrivez, ne recommandez pas.</w:t>
       </w:r>
     </w:p>
     <w:p>
@@ -1745,7 +1745,31 @@
         <w:pStyle w:val="Heading2"/>
       </w:pPr>
       <w:r>
-        <w:t>6.1 Q1 — Réserver et payer en ligne</w:t>
+        <w:t xml:space="preserve">6.1 Notre question, en profondeur : Q_ — [titre de la question]</w:t>
+      </w:r>
+    </w:p>
+    <w:p>
+      <w:pPr>
+        <w:pBdr>
+          <w:left w:val="single" w:sz="24" w:space="6" w:color="3730A3"/>
+        </w:pBdr>
+        <w:shd w:val="clear" w:color="auto" w:fill="E0E7FF"/>
+        <w:spacing w:before="120" w:after="120"/>
+        <w:ind w:left="144"/>
+      </w:pPr>
+      <w:r>
+        <w:rPr>
+          <w:b/>
+          <w:color w:val="3730A3"/>
+        </w:rPr>
+        <w:t xml:space="preserve">EN PROFONDEUR — avec vos essais. </w:t>
+      </w:r>
+      <w:r>
+        <w:rPr>
+          <w:i/>
+          <w:color w:val="56616C"/>
+        </w:rPr>
+        <w:t xml:space="preserve">Une seule question : celle que votre équipe a essayée aux séances 3 et 4. Deux ou trois outils, toutes les lignes du tableau, résultats de vos essais (détail en annexe A).</w:t>
       </w:r>
     </w:p>
     <w:p>
@@ -1753,7 +1777,7 @@
         <w:pStyle w:val="Heading3"/>
       </w:pPr>
       <w:r>
-        <w:t>Le besoin</w:t>
+        <w:t xml:space="preserve">Le besoin</w:t>
       </w:r>
     </w:p>
     <w:p>
@@ -1762,7 +1786,7 @@
           <w:i/>
           <w:color w:val="56616C"/>
         </w:rPr>
-        <w:t>Rappel des exigences et des contraintes qui touchent cette question (renvoyer aux sections 3 et 4).</w:t>
+        <w:t xml:space="preserve">Rappel des exigences et des contraintes qui touchent cette question (renvoyer aux sections 3 et 4).</w:t>
       </w:r>
     </w:p>
     <w:p>
@@ -1770,7 +1794,7 @@
         <w:pStyle w:val="Heading3"/>
       </w:pPr>
       <w:r>
-        <w:t>Les familles de solutions</w:t>
+        <w:t xml:space="preserve">Les familles de solutions</w:t>
       </w:r>
     </w:p>
     <w:p>
@@ -1779,7 +1803,7 @@
           <w:i/>
           <w:color w:val="56616C"/>
         </w:rPr>
-        <w:t>Par exemple : un service spécialisé, une fonction de la plateforme du site, un développement sur mesure.</w:t>
+        <w:t xml:space="preserve">Par exemple : un service spécialisé, une fonction de la plateforme du site, un développement sur mesure.</w:t>
       </w:r>
     </w:p>
     <w:p>
@@ -1787,7 +1811,7 @@
         <w:pStyle w:val="Heading3"/>
       </w:pPr>
       <w:r>
-        <w:t>Comparaison</w:t>
+        <w:t xml:space="preserve">Comparaison</w:t>
       </w:r>
     </w:p>
     <w:tbl>
@@ -1797,10 +1821,10 @@
         <w:tblLook w:firstColumn="1" w:firstRow="1" w:lastColumn="0" w:lastRow="0" w:noHBand="0" w:noVBand="1" w:val="04A0"/>
       </w:tblPr>
       <w:tblGrid>
-        <w:gridCol w:w="2520"/>
-        <w:gridCol w:w="2520"/>
-        <w:gridCol w:w="2520"/>
-        <w:gridCol w:w="2520"/>
+        <w:gridCol w:w="2736"/>
+        <w:gridCol w:w="2448"/>
+        <w:gridCol w:w="2448"/>
+        <w:gridCol w:w="2448"/>
       </w:tblGrid>
       <w:tr>
         <w:tc>
@@ -1809,12 +1833,11 @@
             <w:shd w:val="clear" w:color="auto" w:fill="E0E7FF"/>
           </w:tcPr>
           <w:p>
-            <w:r/>
             <w:r>
               <w:rPr>
                 <w:b/>
               </w:rPr>
-              <w:t>Critère</w:t>
+              <w:t xml:space="preserve">Critère</w:t>
             </w:r>
           </w:p>
         </w:tc>
@@ -1824,12 +1847,11 @@
             <w:shd w:val="clear" w:color="auto" w:fill="E0E7FF"/>
           </w:tcPr>
           <w:p>
-            <w:r/>
             <w:r>
               <w:rPr>
                 <w:b/>
               </w:rPr>
-              <w:t>Outil 1 :</w:t>
+              <w:t xml:space="preserve">Outil 1 :</w:t>
             </w:r>
           </w:p>
         </w:tc>
@@ -1839,12 +1861,11 @@
             <w:shd w:val="clear" w:color="auto" w:fill="E0E7FF"/>
           </w:tcPr>
           <w:p>
-            <w:r/>
             <w:r>
               <w:rPr>
                 <w:b/>
               </w:rPr>
-              <w:t>Outil 2 :</w:t>
+              <w:t xml:space="preserve">Outil 2 :</w:t>
             </w:r>
           </w:p>
         </w:tc>
@@ -1854,12 +1875,11 @@
             <w:shd w:val="clear" w:color="auto" w:fill="E0E7FF"/>
           </w:tcPr>
           <w:p>
-            <w:r/>
             <w:r>
               <w:rPr>
                 <w:b/>
               </w:rPr>
-              <w:t>Outil 3 :</w:t>
+              <w:t xml:space="preserve">Outil 3 :</w:t>
             </w:r>
           </w:p>
         </w:tc>
@@ -1871,7 +1891,7 @@
           </w:tcPr>
           <w:p>
             <w:r>
-              <w:t>Ce qu'il fait pour ce besoin</w:t>
+              <w:t xml:space="preserve">Ce qu'il fait pour ce besoin</w:t>
             </w:r>
           </w:p>
         </w:tc>
@@ -1907,7 +1927,7 @@
           </w:tcPr>
           <w:p>
             <w:r>
-              <w:t>Modèle de prix</w:t>
+              <w:t xml:space="preserve">Modèle de prix</w:t>
             </w:r>
           </w:p>
         </w:tc>
@@ -1943,7 +1963,7 @@
           </w:tcPr>
           <w:p>
             <w:r>
-              <w:t>Coût estimé sur 3 ans ($ CA, hypothèses en note)</w:t>
+              <w:t xml:space="preserve">Coût estimé sur 3 ans ($ CA)</w:t>
             </w:r>
           </w:p>
         </w:tc>
@@ -1979,7 +1999,7 @@
           </w:tcPr>
           <w:p>
             <w:r>
-              <w:t>Temps pour apprendre à s'en servir</w:t>
+              <w:t xml:space="preserve">Temps pour apprendre à s'en servir</w:t>
             </w:r>
           </w:p>
         </w:tc>
@@ -2015,7 +2035,7 @@
           </w:tcPr>
           <w:p>
             <w:r>
-              <w:t>Source(s) ou essai</w:t>
+              <w:t xml:space="preserve">Source(s) ou essai</w:t>
             </w:r>
           </w:p>
         </w:tc>
@@ -2047,11 +2067,20 @@
     </w:tbl>
     <w:p/>
     <w:p>
+      <w:r>
+        <w:rPr>
+          <w:i/>
+          <w:color w:val="56616C"/>
+        </w:rPr>
+        <w:t xml:space="preserve">Hypothèses du coût sur trois ans : la date de lecture des prix, le taux de change, le nombre de participants ou de réservations.</w:t>
+      </w:r>
+    </w:p>
+    <w:p>
       <w:pPr>
         <w:pStyle w:val="Heading3"/>
       </w:pPr>
       <w:r>
-        <w:t>Avantages, limites et points à vérifier</w:t>
+        <w:t xml:space="preserve">Avantages, limites et points à vérifier</w:t>
       </w:r>
     </w:p>
     <w:p>
@@ -2060,7 +2089,7 @@
           <w:i/>
           <w:color w:val="56616C"/>
         </w:rPr>
-        <w:t>Pour ce client-ci : l'effet sur Mélanie, les guides, les clients, le budget, la Loi 25…</w:t>
+        <w:t xml:space="preserve">Pour ce client-ci : l'effet sur Mélanie, les guides, les clients, le budget, la Loi 25… Deux ou trois constats appuyés sur vos essais, sans recommander.</w:t>
       </w:r>
     </w:p>
     <w:p>
@@ -2068,7 +2097,31 @@
         <w:pStyle w:val="Heading2"/>
       </w:pPr>
       <w:r>
-        <w:t>6.2 Q2 — Faire signer la décharge avant l'arrivée</w:t>
+        <w:t xml:space="preserve">6.2 Les quatre autres questions, en survol</w:t>
+      </w:r>
+    </w:p>
+    <w:p>
+      <w:pPr>
+        <w:pBdr>
+          <w:left w:val="single" w:sz="24" w:space="6" w:color="92400E"/>
+        </w:pBdr>
+        <w:shd w:val="clear" w:color="auto" w:fill="FEF3C7"/>
+        <w:spacing w:before="120" w:after="120"/>
+        <w:ind w:left="144"/>
+      </w:pPr>
+      <w:r>
+        <w:rPr>
+          <w:b/>
+          <w:color w:val="92400E"/>
+        </w:rPr>
+        <w:t xml:space="preserve">SURVOL — sans essai, environ une demi-page par question. </w:t>
+      </w:r>
+      <w:r>
+        <w:rPr>
+          <w:i/>
+          <w:color w:val="56616C"/>
+        </w:rPr>
+        <w:t xml:space="preserve">Pour chacune : le besoin en quelques lignes, un tableau court de deux outils, les points qu'un essai devrait vérifier. Pas de familles de solutions, pas de troisième outil, pas de temps pour apprendre. Vos sources : votre recherche documentaire et vos notes du retour en grand groupe de la séance 5, en indiquant d'où vient l'information (par exemple : « essai de l'équipe 3, séance 5 »).</w:t>
       </w:r>
     </w:p>
     <w:p>
@@ -2076,7 +2129,15 @@
         <w:pStyle w:val="Heading3"/>
       </w:pPr>
       <w:r>
-        <w:t>Le besoin</w:t>
+        <w:t xml:space="preserve">Q_ — [titre de la question]</w:t>
+      </w:r>
+    </w:p>
+    <w:p>
+      <w:r>
+        <w:rPr>
+          <w:b/>
+        </w:rPr>
+        <w:t xml:space="preserve">Le besoin</w:t>
       </w:r>
     </w:p>
     <w:p>
@@ -2085,32 +2146,7 @@
           <w:i/>
           <w:color w:val="56616C"/>
         </w:rPr>
-        <w:t>Rappel des exigences et des contraintes qui touchent cette question (renvoyer aux sections 3 et 4).</w:t>
-      </w:r>
-    </w:p>
-    <w:p>
-      <w:pPr>
-        <w:pStyle w:val="Heading3"/>
-      </w:pPr>
-      <w:r>
-        <w:t>Les familles de solutions</w:t>
-      </w:r>
-    </w:p>
-    <w:p>
-      <w:r>
-        <w:rPr>
-          <w:i/>
-          <w:color w:val="56616C"/>
-        </w:rPr>
-        <w:t>Par exemple : un service spécialisé, une fonction de la plateforme du site, un développement sur mesure.</w:t>
-      </w:r>
-    </w:p>
-    <w:p>
-      <w:pPr>
-        <w:pStyle w:val="Heading3"/>
-      </w:pPr>
-      <w:r>
-        <w:t>Comparaison</w:t>
+        <w:t xml:space="preserve">En deux ou trois lignes, avec un renvoi aux sections 3 et 4.</w:t>
       </w:r>
     </w:p>
     <w:tbl>
@@ -2120,69 +2156,50 @@
         <w:tblLook w:firstColumn="1" w:firstRow="1" w:lastColumn="0" w:lastRow="0" w:noHBand="0" w:noVBand="1" w:val="04A0"/>
       </w:tblPr>
       <w:tblGrid>
-        <w:gridCol w:w="2520"/>
-        <w:gridCol w:w="2520"/>
-        <w:gridCol w:w="2520"/>
-        <w:gridCol w:w="2520"/>
+        <w:gridCol w:w="2736"/>
+        <w:gridCol w:w="3672"/>
+        <w:gridCol w:w="3672"/>
       </w:tblGrid>
       <w:tr>
         <w:tc>
           <w:tcPr>
             <w:tcW w:type="dxa" w:w="2736"/>
-            <w:shd w:val="clear" w:color="auto" w:fill="E0E7FF"/>
+            <w:shd w:val="clear" w:color="auto" w:fill="FEF3C7"/>
           </w:tcPr>
           <w:p>
-            <w:r/>
             <w:r>
               <w:rPr>
                 <w:b/>
               </w:rPr>
-              <w:t>Critère</w:t>
+              <w:t xml:space="preserve">Critère</w:t>
             </w:r>
           </w:p>
         </w:tc>
         <w:tc>
           <w:tcPr>
-            <w:tcW w:type="dxa" w:w="2448"/>
-            <w:shd w:val="clear" w:color="auto" w:fill="E0E7FF"/>
+            <w:tcW w:type="dxa" w:w="3672"/>
+            <w:shd w:val="clear" w:color="auto" w:fill="FEF3C7"/>
           </w:tcPr>
           <w:p>
-            <w:r/>
             <w:r>
               <w:rPr>
                 <w:b/>
               </w:rPr>
-              <w:t>Outil 1 :</w:t>
+              <w:t xml:space="preserve">Outil 1 :</w:t>
             </w:r>
           </w:p>
         </w:tc>
         <w:tc>
           <w:tcPr>
-            <w:tcW w:type="dxa" w:w="2448"/>
-            <w:shd w:val="clear" w:color="auto" w:fill="E0E7FF"/>
+            <w:tcW w:type="dxa" w:w="3672"/>
+            <w:shd w:val="clear" w:color="auto" w:fill="FEF3C7"/>
           </w:tcPr>
           <w:p>
-            <w:r/>
             <w:r>
               <w:rPr>
                 <w:b/>
               </w:rPr>
-              <w:t>Outil 2 :</w:t>
-            </w:r>
-          </w:p>
-        </w:tc>
-        <w:tc>
-          <w:tcPr>
-            <w:tcW w:type="dxa" w:w="2448"/>
-            <w:shd w:val="clear" w:color="auto" w:fill="E0E7FF"/>
-          </w:tcPr>
-          <w:p>
-            <w:r/>
-            <w:r>
-              <w:rPr>
-                <w:b/>
-              </w:rPr>
-              <w:t>Outil 3 :</w:t>
+              <w:t xml:space="preserve">Outil 2 :</w:t>
             </w:r>
           </w:p>
         </w:tc>
@@ -2194,13 +2211,13 @@
           </w:tcPr>
           <w:p>
             <w:r>
-              <w:t>Ce qu'il fait pour ce besoin</w:t>
+              <w:t xml:space="preserve">Ce qu'il fait pour ce besoin</w:t>
             </w:r>
           </w:p>
         </w:tc>
         <w:tc>
           <w:tcPr>
-            <w:tcW w:type="dxa" w:w="2448"/>
+            <w:tcW w:type="dxa" w:w="3672"/>
           </w:tcPr>
           <w:p>
             <w:r/>
@@ -2208,15 +2225,7 @@
         </w:tc>
         <w:tc>
           <w:tcPr>
-            <w:tcW w:type="dxa" w:w="2448"/>
-          </w:tcPr>
-          <w:p>
-            <w:r/>
-          </w:p>
-        </w:tc>
-        <w:tc>
-          <w:tcPr>
-            <w:tcW w:type="dxa" w:w="2448"/>
+            <w:tcW w:type="dxa" w:w="3672"/>
           </w:tcPr>
           <w:p>
             <w:r/>
@@ -2230,13 +2239,13 @@
           </w:tcPr>
           <w:p>
             <w:r>
-              <w:t>Modèle de prix</w:t>
+              <w:t xml:space="preserve">Modèle de prix</w:t>
             </w:r>
           </w:p>
         </w:tc>
         <w:tc>
           <w:tcPr>
-            <w:tcW w:type="dxa" w:w="2448"/>
+            <w:tcW w:type="dxa" w:w="3672"/>
           </w:tcPr>
           <w:p>
             <w:r/>
@@ -2244,15 +2253,7 @@
         </w:tc>
         <w:tc>
           <w:tcPr>
-            <w:tcW w:type="dxa" w:w="2448"/>
-          </w:tcPr>
-          <w:p>
-            <w:r/>
-          </w:p>
-        </w:tc>
-        <w:tc>
-          <w:tcPr>
-            <w:tcW w:type="dxa" w:w="2448"/>
+            <w:tcW w:type="dxa" w:w="3672"/>
           </w:tcPr>
           <w:p>
             <w:r/>
@@ -2266,13 +2267,13 @@
           </w:tcPr>
           <w:p>
             <w:r>
-              <w:t>Coût estimé sur 3 ans ($ CA, hypothèses en note)</w:t>
+              <w:t xml:space="preserve">Coût estimé sur 3 ans ($ CA)</w:t>
             </w:r>
           </w:p>
         </w:tc>
         <w:tc>
           <w:tcPr>
-            <w:tcW w:type="dxa" w:w="2448"/>
+            <w:tcW w:type="dxa" w:w="3672"/>
           </w:tcPr>
           <w:p>
             <w:r/>
@@ -2280,15 +2281,7 @@
         </w:tc>
         <w:tc>
           <w:tcPr>
-            <w:tcW w:type="dxa" w:w="2448"/>
-          </w:tcPr>
-          <w:p>
-            <w:r/>
-          </w:p>
-        </w:tc>
-        <w:tc>
-          <w:tcPr>
-            <w:tcW w:type="dxa" w:w="2448"/>
+            <w:tcW w:type="dxa" w:w="3672"/>
           </w:tcPr>
           <w:p>
             <w:r/>
@@ -2302,13 +2295,13 @@
           </w:tcPr>
           <w:p>
             <w:r>
-              <w:t>Temps pour apprendre à s'en servir</w:t>
+              <w:t xml:space="preserve">Principale limite pour ce client</w:t>
             </w:r>
           </w:p>
         </w:tc>
         <w:tc>
           <w:tcPr>
-            <w:tcW w:type="dxa" w:w="2448"/>
+            <w:tcW w:type="dxa" w:w="3672"/>
           </w:tcPr>
           <w:p>
             <w:r/>
@@ -2316,15 +2309,7 @@
         </w:tc>
         <w:tc>
           <w:tcPr>
-            <w:tcW w:type="dxa" w:w="2448"/>
-          </w:tcPr>
-          <w:p>
-            <w:r/>
-          </w:p>
-        </w:tc>
-        <w:tc>
-          <w:tcPr>
-            <w:tcW w:type="dxa" w:w="2448"/>
+            <w:tcW w:type="dxa" w:w="3672"/>
           </w:tcPr>
           <w:p>
             <w:r/>
@@ -2338,13 +2323,13 @@
           </w:tcPr>
           <w:p>
             <w:r>
-              <w:t>Source(s) ou essai</w:t>
+              <w:t xml:space="preserve">Source(s)</w:t>
             </w:r>
           </w:p>
         </w:tc>
         <w:tc>
           <w:tcPr>
-            <w:tcW w:type="dxa" w:w="2448"/>
+            <w:tcW w:type="dxa" w:w="3672"/>
           </w:tcPr>
           <w:p>
             <w:r/>
@@ -2352,15 +2337,7 @@
         </w:tc>
         <w:tc>
           <w:tcPr>
-            <w:tcW w:type="dxa" w:w="2448"/>
-          </w:tcPr>
-          <w:p>
-            <w:r/>
-          </w:p>
-        </w:tc>
-        <w:tc>
-          <w:tcPr>
-            <w:tcW w:type="dxa" w:w="2448"/>
+            <w:tcW w:type="dxa" w:w="3672"/>
           </w:tcPr>
           <w:p>
             <w:r/>
@@ -2370,11 +2347,11 @@
     </w:tbl>
     <w:p/>
     <w:p>
-      <w:pPr>
-        <w:pStyle w:val="Heading3"/>
-      </w:pPr>
       <w:r>
-        <w:t>Avantages, limites et points à vérifier</w:t>
+        <w:rPr>
+          <w:b/>
+        </w:rPr>
+        <w:t xml:space="preserve">Les points qu'un essai devrait vérifier</w:t>
       </w:r>
     </w:p>
     <w:p>
@@ -2383,15 +2360,7 @@
           <w:i/>
           <w:color w:val="56616C"/>
         </w:rPr>
-        <w:t>Pour ce client-ci : l'effet sur Mélanie, les guides, les clients, le budget, la Loi 25…</w:t>
-      </w:r>
-    </w:p>
-    <w:p>
-      <w:pPr>
-        <w:pStyle w:val="Heading2"/>
-      </w:pPr>
-      <w:r>
-        <w:t>6.3 Q3 — La plateforme du site</w:t>
+        <w:t xml:space="preserve">Ce que la source annonce et que seul un essai pourrait confirmer.</w:t>
       </w:r>
     </w:p>
     <w:p>
@@ -2399,7 +2368,15 @@
         <w:pStyle w:val="Heading3"/>
       </w:pPr>
       <w:r>
-        <w:t>Le besoin</w:t>
+        <w:t xml:space="preserve">Q_ — [titre de la question]</w:t>
+      </w:r>
+    </w:p>
+    <w:p>
+      <w:r>
+        <w:rPr>
+          <w:b/>
+        </w:rPr>
+        <w:t xml:space="preserve">Le besoin</w:t>
       </w:r>
     </w:p>
     <w:p>
@@ -2408,32 +2385,7 @@
           <w:i/>
           <w:color w:val="56616C"/>
         </w:rPr>
-        <w:t>Rappel des exigences et des contraintes qui touchent cette question (renvoyer aux sections 3 et 4).</w:t>
-      </w:r>
-    </w:p>
-    <w:p>
-      <w:pPr>
-        <w:pStyle w:val="Heading3"/>
-      </w:pPr>
-      <w:r>
-        <w:t>Les familles de solutions</w:t>
-      </w:r>
-    </w:p>
-    <w:p>
-      <w:r>
-        <w:rPr>
-          <w:i/>
-          <w:color w:val="56616C"/>
-        </w:rPr>
-        <w:t>Par exemple : un service spécialisé, une fonction de la plateforme du site, un développement sur mesure.</w:t>
-      </w:r>
-    </w:p>
-    <w:p>
-      <w:pPr>
-        <w:pStyle w:val="Heading3"/>
-      </w:pPr>
-      <w:r>
-        <w:t>Comparaison</w:t>
+        <w:t xml:space="preserve">En deux ou trois lignes, avec un renvoi aux sections 3 et 4.</w:t>
       </w:r>
     </w:p>
     <w:tbl>
@@ -2443,69 +2395,50 @@
         <w:tblLook w:firstColumn="1" w:firstRow="1" w:lastColumn="0" w:lastRow="0" w:noHBand="0" w:noVBand="1" w:val="04A0"/>
       </w:tblPr>
       <w:tblGrid>
-        <w:gridCol w:w="2520"/>
-        <w:gridCol w:w="2520"/>
-        <w:gridCol w:w="2520"/>
-        <w:gridCol w:w="2520"/>
+        <w:gridCol w:w="2736"/>
+        <w:gridCol w:w="3672"/>
+        <w:gridCol w:w="3672"/>
       </w:tblGrid>
       <w:tr>
         <w:tc>
           <w:tcPr>
             <w:tcW w:type="dxa" w:w="2736"/>
-            <w:shd w:val="clear" w:color="auto" w:fill="E0E7FF"/>
+            <w:shd w:val="clear" w:color="auto" w:fill="FEF3C7"/>
           </w:tcPr>
           <w:p>
-            <w:r/>
             <w:r>
               <w:rPr>
                 <w:b/>
               </w:rPr>
-              <w:t>Critère</w:t>
+              <w:t xml:space="preserve">Critère</w:t>
             </w:r>
           </w:p>
         </w:tc>
         <w:tc>
           <w:tcPr>
-            <w:tcW w:type="dxa" w:w="2448"/>
-            <w:shd w:val="clear" w:color="auto" w:fill="E0E7FF"/>
+            <w:tcW w:type="dxa" w:w="3672"/>
+            <w:shd w:val="clear" w:color="auto" w:fill="FEF3C7"/>
           </w:tcPr>
           <w:p>
-            <w:r/>
             <w:r>
               <w:rPr>
                 <w:b/>
               </w:rPr>
-              <w:t>Outil 1 :</w:t>
+              <w:t xml:space="preserve">Outil 1 :</w:t>
             </w:r>
           </w:p>
         </w:tc>
         <w:tc>
           <w:tcPr>
-            <w:tcW w:type="dxa" w:w="2448"/>
-            <w:shd w:val="clear" w:color="auto" w:fill="E0E7FF"/>
+            <w:tcW w:type="dxa" w:w="3672"/>
+            <w:shd w:val="clear" w:color="auto" w:fill="FEF3C7"/>
           </w:tcPr>
           <w:p>
-            <w:r/>
             <w:r>
               <w:rPr>
                 <w:b/>
               </w:rPr>
-              <w:t>Outil 2 :</w:t>
-            </w:r>
-          </w:p>
-        </w:tc>
-        <w:tc>
-          <w:tcPr>
-            <w:tcW w:type="dxa" w:w="2448"/>
-            <w:shd w:val="clear" w:color="auto" w:fill="E0E7FF"/>
-          </w:tcPr>
-          <w:p>
-            <w:r/>
-            <w:r>
-              <w:rPr>
-                <w:b/>
-              </w:rPr>
-              <w:t>Outil 3 :</w:t>
+              <w:t xml:space="preserve">Outil 2 :</w:t>
             </w:r>
           </w:p>
         </w:tc>
@@ -2517,13 +2450,13 @@
           </w:tcPr>
           <w:p>
             <w:r>
-              <w:t>Ce qu'il fait pour ce besoin</w:t>
+              <w:t xml:space="preserve">Ce qu'il fait pour ce besoin</w:t>
             </w:r>
           </w:p>
         </w:tc>
         <w:tc>
           <w:tcPr>
-            <w:tcW w:type="dxa" w:w="2448"/>
+            <w:tcW w:type="dxa" w:w="3672"/>
           </w:tcPr>
           <w:p>
             <w:r/>
@@ -2531,15 +2464,7 @@
         </w:tc>
         <w:tc>
           <w:tcPr>
-            <w:tcW w:type="dxa" w:w="2448"/>
-          </w:tcPr>
-          <w:p>
-            <w:r/>
-          </w:p>
-        </w:tc>
-        <w:tc>
-          <w:tcPr>
-            <w:tcW w:type="dxa" w:w="2448"/>
+            <w:tcW w:type="dxa" w:w="3672"/>
           </w:tcPr>
           <w:p>
             <w:r/>
@@ -2553,13 +2478,13 @@
           </w:tcPr>
           <w:p>
             <w:r>
-              <w:t>Modèle de prix</w:t>
+              <w:t xml:space="preserve">Modèle de prix</w:t>
             </w:r>
           </w:p>
         </w:tc>
         <w:tc>
           <w:tcPr>
-            <w:tcW w:type="dxa" w:w="2448"/>
+            <w:tcW w:type="dxa" w:w="3672"/>
           </w:tcPr>
           <w:p>
             <w:r/>
@@ -2567,15 +2492,7 @@
         </w:tc>
         <w:tc>
           <w:tcPr>
-            <w:tcW w:type="dxa" w:w="2448"/>
-          </w:tcPr>
-          <w:p>
-            <w:r/>
-          </w:p>
-        </w:tc>
-        <w:tc>
-          <w:tcPr>
-            <w:tcW w:type="dxa" w:w="2448"/>
+            <w:tcW w:type="dxa" w:w="3672"/>
           </w:tcPr>
           <w:p>
             <w:r/>
@@ -2589,13 +2506,13 @@
           </w:tcPr>
           <w:p>
             <w:r>
-              <w:t>Coût estimé sur 3 ans ($ CA, hypothèses en note)</w:t>
+              <w:t xml:space="preserve">Coût estimé sur 3 ans ($ CA)</w:t>
             </w:r>
           </w:p>
         </w:tc>
         <w:tc>
           <w:tcPr>
-            <w:tcW w:type="dxa" w:w="2448"/>
+            <w:tcW w:type="dxa" w:w="3672"/>
           </w:tcPr>
           <w:p>
             <w:r/>
@@ -2603,15 +2520,7 @@
         </w:tc>
         <w:tc>
           <w:tcPr>
-            <w:tcW w:type="dxa" w:w="2448"/>
-          </w:tcPr>
-          <w:p>
-            <w:r/>
-          </w:p>
-        </w:tc>
-        <w:tc>
-          <w:tcPr>
-            <w:tcW w:type="dxa" w:w="2448"/>
+            <w:tcW w:type="dxa" w:w="3672"/>
           </w:tcPr>
           <w:p>
             <w:r/>
@@ -2625,13 +2534,13 @@
           </w:tcPr>
           <w:p>
             <w:r>
-              <w:t>Temps pour apprendre à s'en servir</w:t>
+              <w:t xml:space="preserve">Principale limite pour ce client</w:t>
             </w:r>
           </w:p>
         </w:tc>
         <w:tc>
           <w:tcPr>
-            <w:tcW w:type="dxa" w:w="2448"/>
+            <w:tcW w:type="dxa" w:w="3672"/>
           </w:tcPr>
           <w:p>
             <w:r/>
@@ -2639,15 +2548,7 @@
         </w:tc>
         <w:tc>
           <w:tcPr>
-            <w:tcW w:type="dxa" w:w="2448"/>
-          </w:tcPr>
-          <w:p>
-            <w:r/>
-          </w:p>
-        </w:tc>
-        <w:tc>
-          <w:tcPr>
-            <w:tcW w:type="dxa" w:w="2448"/>
+            <w:tcW w:type="dxa" w:w="3672"/>
           </w:tcPr>
           <w:p>
             <w:r/>
@@ -2661,13 +2562,13 @@
           </w:tcPr>
           <w:p>
             <w:r>
-              <w:t>Source(s) ou essai</w:t>
+              <w:t xml:space="preserve">Source(s)</w:t>
             </w:r>
           </w:p>
         </w:tc>
         <w:tc>
           <w:tcPr>
-            <w:tcW w:type="dxa" w:w="2448"/>
+            <w:tcW w:type="dxa" w:w="3672"/>
           </w:tcPr>
           <w:p>
             <w:r/>
@@ -2675,15 +2576,7 @@
         </w:tc>
         <w:tc>
           <w:tcPr>
-            <w:tcW w:type="dxa" w:w="2448"/>
-          </w:tcPr>
-          <w:p>
-            <w:r/>
-          </w:p>
-        </w:tc>
-        <w:tc>
-          <w:tcPr>
-            <w:tcW w:type="dxa" w:w="2448"/>
+            <w:tcW w:type="dxa" w:w="3672"/>
           </w:tcPr>
           <w:p>
             <w:r/>
@@ -2693,11 +2586,11 @@
     </w:tbl>
     <w:p/>
     <w:p>
-      <w:pPr>
-        <w:pStyle w:val="Heading3"/>
-      </w:pPr>
       <w:r>
-        <w:t>Avantages, limites et points à vérifier</w:t>
+        <w:rPr>
+          <w:b/>
+        </w:rPr>
+        <w:t xml:space="preserve">Les points qu'un essai devrait vérifier</w:t>
       </w:r>
     </w:p>
     <w:p>
@@ -2706,15 +2599,7 @@
           <w:i/>
           <w:color w:val="56616C"/>
         </w:rPr>
-        <w:t>Pour ce client-ci : l'effet sur Mélanie, les guides, les clients, le budget, la Loi 25…</w:t>
-      </w:r>
-    </w:p>
-    <w:p>
-      <w:pPr>
-        <w:pStyle w:val="Heading2"/>
-      </w:pPr>
-      <w:r>
-        <w:t>6.4 Q4 — Montrer les vidéos sans ralentir le site</w:t>
+        <w:t xml:space="preserve">Ce que la source annonce et que seul un essai pourrait confirmer.</w:t>
       </w:r>
     </w:p>
     <w:p>
@@ -2722,7 +2607,15 @@
         <w:pStyle w:val="Heading3"/>
       </w:pPr>
       <w:r>
-        <w:t>Le besoin</w:t>
+        <w:t xml:space="preserve">Q_ — [titre de la question]</w:t>
+      </w:r>
+    </w:p>
+    <w:p>
+      <w:r>
+        <w:rPr>
+          <w:b/>
+        </w:rPr>
+        <w:t xml:space="preserve">Le besoin</w:t>
       </w:r>
     </w:p>
     <w:p>
@@ -2731,32 +2624,7 @@
           <w:i/>
           <w:color w:val="56616C"/>
         </w:rPr>
-        <w:t>Rappel des exigences et des contraintes qui touchent cette question (renvoyer aux sections 3 et 4).</w:t>
-      </w:r>
-    </w:p>
-    <w:p>
-      <w:pPr>
-        <w:pStyle w:val="Heading3"/>
-      </w:pPr>
-      <w:r>
-        <w:t>Les familles de solutions</w:t>
-      </w:r>
-    </w:p>
-    <w:p>
-      <w:r>
-        <w:rPr>
-          <w:i/>
-          <w:color w:val="56616C"/>
-        </w:rPr>
-        <w:t>Par exemple : un service spécialisé, une fonction de la plateforme du site, un développement sur mesure.</w:t>
-      </w:r>
-    </w:p>
-    <w:p>
-      <w:pPr>
-        <w:pStyle w:val="Heading3"/>
-      </w:pPr>
-      <w:r>
-        <w:t>Comparaison</w:t>
+        <w:t xml:space="preserve">En deux ou trois lignes, avec un renvoi aux sections 3 et 4.</w:t>
       </w:r>
     </w:p>
     <w:tbl>
@@ -2766,69 +2634,50 @@
         <w:tblLook w:firstColumn="1" w:firstRow="1" w:lastColumn="0" w:lastRow="0" w:noHBand="0" w:noVBand="1" w:val="04A0"/>
       </w:tblPr>
       <w:tblGrid>
-        <w:gridCol w:w="2520"/>
-        <w:gridCol w:w="2520"/>
-        <w:gridCol w:w="2520"/>
-        <w:gridCol w:w="2520"/>
+        <w:gridCol w:w="2736"/>
+        <w:gridCol w:w="3672"/>
+        <w:gridCol w:w="3672"/>
       </w:tblGrid>
       <w:tr>
         <w:tc>
           <w:tcPr>
             <w:tcW w:type="dxa" w:w="2736"/>
-            <w:shd w:val="clear" w:color="auto" w:fill="E0E7FF"/>
+            <w:shd w:val="clear" w:color="auto" w:fill="FEF3C7"/>
           </w:tcPr>
           <w:p>
-            <w:r/>
             <w:r>
               <w:rPr>
                 <w:b/>
               </w:rPr>
-              <w:t>Critère</w:t>
+              <w:t xml:space="preserve">Critère</w:t>
             </w:r>
           </w:p>
         </w:tc>
         <w:tc>
           <w:tcPr>
-            <w:tcW w:type="dxa" w:w="2448"/>
-            <w:shd w:val="clear" w:color="auto" w:fill="E0E7FF"/>
+            <w:tcW w:type="dxa" w:w="3672"/>
+            <w:shd w:val="clear" w:color="auto" w:fill="FEF3C7"/>
           </w:tcPr>
           <w:p>
-            <w:r/>
             <w:r>
               <w:rPr>
                 <w:b/>
               </w:rPr>
-              <w:t>Outil 1 :</w:t>
+              <w:t xml:space="preserve">Outil 1 :</w:t>
             </w:r>
           </w:p>
         </w:tc>
         <w:tc>
           <w:tcPr>
-            <w:tcW w:type="dxa" w:w="2448"/>
-            <w:shd w:val="clear" w:color="auto" w:fill="E0E7FF"/>
+            <w:tcW w:type="dxa" w:w="3672"/>
+            <w:shd w:val="clear" w:color="auto" w:fill="FEF3C7"/>
           </w:tcPr>
           <w:p>
-            <w:r/>
             <w:r>
               <w:rPr>
                 <w:b/>
               </w:rPr>
-              <w:t>Outil 2 :</w:t>
-            </w:r>
-          </w:p>
-        </w:tc>
-        <w:tc>
-          <w:tcPr>
-            <w:tcW w:type="dxa" w:w="2448"/>
-            <w:shd w:val="clear" w:color="auto" w:fill="E0E7FF"/>
-          </w:tcPr>
-          <w:p>
-            <w:r/>
-            <w:r>
-              <w:rPr>
-                <w:b/>
-              </w:rPr>
-              <w:t>Outil 3 :</w:t>
+              <w:t xml:space="preserve">Outil 2 :</w:t>
             </w:r>
           </w:p>
         </w:tc>
@@ -2840,13 +2689,13 @@
           </w:tcPr>
           <w:p>
             <w:r>
-              <w:t>Ce qu'il fait pour ce besoin</w:t>
+              <w:t xml:space="preserve">Ce qu'il fait pour ce besoin</w:t>
             </w:r>
           </w:p>
         </w:tc>
         <w:tc>
           <w:tcPr>
-            <w:tcW w:type="dxa" w:w="2448"/>
+            <w:tcW w:type="dxa" w:w="3672"/>
           </w:tcPr>
           <w:p>
             <w:r/>
@@ -2854,15 +2703,7 @@
         </w:tc>
         <w:tc>
           <w:tcPr>
-            <w:tcW w:type="dxa" w:w="2448"/>
-          </w:tcPr>
-          <w:p>
-            <w:r/>
-          </w:p>
-        </w:tc>
-        <w:tc>
-          <w:tcPr>
-            <w:tcW w:type="dxa" w:w="2448"/>
+            <w:tcW w:type="dxa" w:w="3672"/>
           </w:tcPr>
           <w:p>
             <w:r/>
@@ -2876,13 +2717,13 @@
           </w:tcPr>
           <w:p>
             <w:r>
-              <w:t>Modèle de prix</w:t>
+              <w:t xml:space="preserve">Modèle de prix</w:t>
             </w:r>
           </w:p>
         </w:tc>
         <w:tc>
           <w:tcPr>
-            <w:tcW w:type="dxa" w:w="2448"/>
+            <w:tcW w:type="dxa" w:w="3672"/>
           </w:tcPr>
           <w:p>
             <w:r/>
@@ -2890,15 +2731,7 @@
         </w:tc>
         <w:tc>
           <w:tcPr>
-            <w:tcW w:type="dxa" w:w="2448"/>
-          </w:tcPr>
-          <w:p>
-            <w:r/>
-          </w:p>
-        </w:tc>
-        <w:tc>
-          <w:tcPr>
-            <w:tcW w:type="dxa" w:w="2448"/>
+            <w:tcW w:type="dxa" w:w="3672"/>
           </w:tcPr>
           <w:p>
             <w:r/>
@@ -2912,13 +2745,13 @@
           </w:tcPr>
           <w:p>
             <w:r>
-              <w:t>Coût estimé sur 3 ans ($ CA, hypothèses en note)</w:t>
+              <w:t xml:space="preserve">Coût estimé sur 3 ans ($ CA)</w:t>
             </w:r>
           </w:p>
         </w:tc>
         <w:tc>
           <w:tcPr>
-            <w:tcW w:type="dxa" w:w="2448"/>
+            <w:tcW w:type="dxa" w:w="3672"/>
           </w:tcPr>
           <w:p>
             <w:r/>
@@ -2926,15 +2759,7 @@
         </w:tc>
         <w:tc>
           <w:tcPr>
-            <w:tcW w:type="dxa" w:w="2448"/>
-          </w:tcPr>
-          <w:p>
-            <w:r/>
-          </w:p>
-        </w:tc>
-        <w:tc>
-          <w:tcPr>
-            <w:tcW w:type="dxa" w:w="2448"/>
+            <w:tcW w:type="dxa" w:w="3672"/>
           </w:tcPr>
           <w:p>
             <w:r/>
@@ -2948,13 +2773,13 @@
           </w:tcPr>
           <w:p>
             <w:r>
-              <w:t>Temps pour apprendre à s'en servir</w:t>
+              <w:t xml:space="preserve">Principale limite pour ce client</w:t>
             </w:r>
           </w:p>
         </w:tc>
         <w:tc>
           <w:tcPr>
-            <w:tcW w:type="dxa" w:w="2448"/>
+            <w:tcW w:type="dxa" w:w="3672"/>
           </w:tcPr>
           <w:p>
             <w:r/>
@@ -2962,15 +2787,7 @@
         </w:tc>
         <w:tc>
           <w:tcPr>
-            <w:tcW w:type="dxa" w:w="2448"/>
-          </w:tcPr>
-          <w:p>
-            <w:r/>
-          </w:p>
-        </w:tc>
-        <w:tc>
-          <w:tcPr>
-            <w:tcW w:type="dxa" w:w="2448"/>
+            <w:tcW w:type="dxa" w:w="3672"/>
           </w:tcPr>
           <w:p>
             <w:r/>
@@ -2984,13 +2801,13 @@
           </w:tcPr>
           <w:p>
             <w:r>
-              <w:t>Source(s) ou essai</w:t>
+              <w:t xml:space="preserve">Source(s)</w:t>
             </w:r>
           </w:p>
         </w:tc>
         <w:tc>
           <w:tcPr>
-            <w:tcW w:type="dxa" w:w="2448"/>
+            <w:tcW w:type="dxa" w:w="3672"/>
           </w:tcPr>
           <w:p>
             <w:r/>
@@ -2998,15 +2815,7 @@
         </w:tc>
         <w:tc>
           <w:tcPr>
-            <w:tcW w:type="dxa" w:w="2448"/>
-          </w:tcPr>
-          <w:p>
-            <w:r/>
-          </w:p>
-        </w:tc>
-        <w:tc>
-          <w:tcPr>
-            <w:tcW w:type="dxa" w:w="2448"/>
+            <w:tcW w:type="dxa" w:w="3672"/>
           </w:tcPr>
           <w:p>
             <w:r/>
@@ -3016,11 +2825,11 @@
     </w:tbl>
     <w:p/>
     <w:p>
-      <w:pPr>
-        <w:pStyle w:val="Heading3"/>
-      </w:pPr>
       <w:r>
-        <w:t>Avantages, limites et points à vérifier</w:t>
+        <w:rPr>
+          <w:b/>
+        </w:rPr>
+        <w:t xml:space="preserve">Les points qu'un essai devrait vérifier</w:t>
       </w:r>
     </w:p>
     <w:p>
@@ -3029,15 +2838,7 @@
           <w:i/>
           <w:color w:val="56616C"/>
         </w:rPr>
-        <w:t>Pour ce client-ci : l'effet sur Mélanie, les guides, les clients, le budget, la Loi 25…</w:t>
-      </w:r>
-    </w:p>
-    <w:p>
-      <w:pPr>
-        <w:pStyle w:val="Heading2"/>
-      </w:pPr>
-      <w:r>
-        <w:t>6.5 Q5 — Offrir le site en français et en anglais</w:t>
+        <w:t xml:space="preserve">Ce que la source annonce et que seul un essai pourrait confirmer.</w:t>
       </w:r>
     </w:p>
     <w:p>
@@ -3045,7 +2846,15 @@
         <w:pStyle w:val="Heading3"/>
       </w:pPr>
       <w:r>
-        <w:t>Le besoin</w:t>
+        <w:t xml:space="preserve">Q_ — [titre de la question]</w:t>
+      </w:r>
+    </w:p>
+    <w:p>
+      <w:r>
+        <w:rPr>
+          <w:b/>
+        </w:rPr>
+        <w:t xml:space="preserve">Le besoin</w:t>
       </w:r>
     </w:p>
     <w:p>
@@ -3054,32 +2863,7 @@
           <w:i/>
           <w:color w:val="56616C"/>
         </w:rPr>
-        <w:t>Rappel des exigences et des contraintes qui touchent cette question (renvoyer aux sections 3 et 4).</w:t>
-      </w:r>
-    </w:p>
-    <w:p>
-      <w:pPr>
-        <w:pStyle w:val="Heading3"/>
-      </w:pPr>
-      <w:r>
-        <w:t>Les familles de solutions</w:t>
-      </w:r>
-    </w:p>
-    <w:p>
-      <w:r>
-        <w:rPr>
-          <w:i/>
-          <w:color w:val="56616C"/>
-        </w:rPr>
-        <w:t>Par exemple : un service spécialisé, une fonction de la plateforme du site, un développement sur mesure.</w:t>
-      </w:r>
-    </w:p>
-    <w:p>
-      <w:pPr>
-        <w:pStyle w:val="Heading3"/>
-      </w:pPr>
-      <w:r>
-        <w:t>Comparaison</w:t>
+        <w:t xml:space="preserve">En deux ou trois lignes, avec un renvoi aux sections 3 et 4.</w:t>
       </w:r>
     </w:p>
     <w:tbl>
@@ -3089,69 +2873,50 @@
         <w:tblLook w:firstColumn="1" w:firstRow="1" w:lastColumn="0" w:lastRow="0" w:noHBand="0" w:noVBand="1" w:val="04A0"/>
       </w:tblPr>
       <w:tblGrid>
-        <w:gridCol w:w="2520"/>
-        <w:gridCol w:w="2520"/>
-        <w:gridCol w:w="2520"/>
-        <w:gridCol w:w="2520"/>
+        <w:gridCol w:w="2736"/>
+        <w:gridCol w:w="3672"/>
+        <w:gridCol w:w="3672"/>
       </w:tblGrid>
       <w:tr>
         <w:tc>
           <w:tcPr>
             <w:tcW w:type="dxa" w:w="2736"/>
-            <w:shd w:val="clear" w:color="auto" w:fill="E0E7FF"/>
+            <w:shd w:val="clear" w:color="auto" w:fill="FEF3C7"/>
           </w:tcPr>
           <w:p>
-            <w:r/>
             <w:r>
               <w:rPr>
                 <w:b/>
               </w:rPr>
-              <w:t>Critère</w:t>
+              <w:t xml:space="preserve">Critère</w:t>
             </w:r>
           </w:p>
         </w:tc>
         <w:tc>
           <w:tcPr>
-            <w:tcW w:type="dxa" w:w="2448"/>
-            <w:shd w:val="clear" w:color="auto" w:fill="E0E7FF"/>
+            <w:tcW w:type="dxa" w:w="3672"/>
+            <w:shd w:val="clear" w:color="auto" w:fill="FEF3C7"/>
           </w:tcPr>
           <w:p>
-            <w:r/>
             <w:r>
               <w:rPr>
                 <w:b/>
               </w:rPr>
-              <w:t>Outil 1 :</w:t>
+              <w:t xml:space="preserve">Outil 1 :</w:t>
             </w:r>
           </w:p>
         </w:tc>
         <w:tc>
           <w:tcPr>
-            <w:tcW w:type="dxa" w:w="2448"/>
-            <w:shd w:val="clear" w:color="auto" w:fill="E0E7FF"/>
+            <w:tcW w:type="dxa" w:w="3672"/>
+            <w:shd w:val="clear" w:color="auto" w:fill="FEF3C7"/>
           </w:tcPr>
           <w:p>
-            <w:r/>
             <w:r>
               <w:rPr>
                 <w:b/>
               </w:rPr>
-              <w:t>Outil 2 :</w:t>
-            </w:r>
-          </w:p>
-        </w:tc>
-        <w:tc>
-          <w:tcPr>
-            <w:tcW w:type="dxa" w:w="2448"/>
-            <w:shd w:val="clear" w:color="auto" w:fill="E0E7FF"/>
-          </w:tcPr>
-          <w:p>
-            <w:r/>
-            <w:r>
-              <w:rPr>
-                <w:b/>
-              </w:rPr>
-              <w:t>Outil 3 :</w:t>
+              <w:t xml:space="preserve">Outil 2 :</w:t>
             </w:r>
           </w:p>
         </w:tc>
@@ -3163,13 +2928,13 @@
           </w:tcPr>
           <w:p>
             <w:r>
-              <w:t>Ce qu'il fait pour ce besoin</w:t>
+              <w:t xml:space="preserve">Ce qu'il fait pour ce besoin</w:t>
             </w:r>
           </w:p>
         </w:tc>
         <w:tc>
           <w:tcPr>
-            <w:tcW w:type="dxa" w:w="2448"/>
+            <w:tcW w:type="dxa" w:w="3672"/>
           </w:tcPr>
           <w:p>
             <w:r/>
@@ -3177,15 +2942,7 @@
         </w:tc>
         <w:tc>
           <w:tcPr>
-            <w:tcW w:type="dxa" w:w="2448"/>
-          </w:tcPr>
-          <w:p>
-            <w:r/>
-          </w:p>
-        </w:tc>
-        <w:tc>
-          <w:tcPr>
-            <w:tcW w:type="dxa" w:w="2448"/>
+            <w:tcW w:type="dxa" w:w="3672"/>
           </w:tcPr>
           <w:p>
             <w:r/>
@@ -3199,13 +2956,13 @@
           </w:tcPr>
           <w:p>
             <w:r>
-              <w:t>Modèle de prix</w:t>
+              <w:t xml:space="preserve">Modèle de prix</w:t>
             </w:r>
           </w:p>
         </w:tc>
         <w:tc>
           <w:tcPr>
-            <w:tcW w:type="dxa" w:w="2448"/>
+            <w:tcW w:type="dxa" w:w="3672"/>
           </w:tcPr>
           <w:p>
             <w:r/>
@@ -3213,15 +2970,7 @@
         </w:tc>
         <w:tc>
           <w:tcPr>
-            <w:tcW w:type="dxa" w:w="2448"/>
-          </w:tcPr>
-          <w:p>
-            <w:r/>
-          </w:p>
-        </w:tc>
-        <w:tc>
-          <w:tcPr>
-            <w:tcW w:type="dxa" w:w="2448"/>
+            <w:tcW w:type="dxa" w:w="3672"/>
           </w:tcPr>
           <w:p>
             <w:r/>
@@ -3235,13 +2984,13 @@
           </w:tcPr>
           <w:p>
             <w:r>
-              <w:t>Coût estimé sur 3 ans ($ CA, hypothèses en note)</w:t>
+              <w:t xml:space="preserve">Coût estimé sur 3 ans ($ CA)</w:t>
             </w:r>
           </w:p>
         </w:tc>
         <w:tc>
           <w:tcPr>
-            <w:tcW w:type="dxa" w:w="2448"/>
+            <w:tcW w:type="dxa" w:w="3672"/>
           </w:tcPr>
           <w:p>
             <w:r/>
@@ -3249,15 +2998,7 @@
         </w:tc>
         <w:tc>
           <w:tcPr>
-            <w:tcW w:type="dxa" w:w="2448"/>
-          </w:tcPr>
-          <w:p>
-            <w:r/>
-          </w:p>
-        </w:tc>
-        <w:tc>
-          <w:tcPr>
-            <w:tcW w:type="dxa" w:w="2448"/>
+            <w:tcW w:type="dxa" w:w="3672"/>
           </w:tcPr>
           <w:p>
             <w:r/>
@@ -3271,13 +3012,13 @@
           </w:tcPr>
           <w:p>
             <w:r>
-              <w:t>Temps pour apprendre à s'en servir</w:t>
+              <w:t xml:space="preserve">Principale limite pour ce client</w:t>
             </w:r>
           </w:p>
         </w:tc>
         <w:tc>
           <w:tcPr>
-            <w:tcW w:type="dxa" w:w="2448"/>
+            <w:tcW w:type="dxa" w:w="3672"/>
           </w:tcPr>
           <w:p>
             <w:r/>
@@ -3285,15 +3026,7 @@
         </w:tc>
         <w:tc>
           <w:tcPr>
-            <w:tcW w:type="dxa" w:w="2448"/>
-          </w:tcPr>
-          <w:p>
-            <w:r/>
-          </w:p>
-        </w:tc>
-        <w:tc>
-          <w:tcPr>
-            <w:tcW w:type="dxa" w:w="2448"/>
+            <w:tcW w:type="dxa" w:w="3672"/>
           </w:tcPr>
           <w:p>
             <w:r/>
@@ -3307,13 +3040,13 @@
           </w:tcPr>
           <w:p>
             <w:r>
-              <w:t>Source(s) ou essai</w:t>
+              <w:t xml:space="preserve">Source(s)</w:t>
             </w:r>
           </w:p>
         </w:tc>
         <w:tc>
           <w:tcPr>
-            <w:tcW w:type="dxa" w:w="2448"/>
+            <w:tcW w:type="dxa" w:w="3672"/>
           </w:tcPr>
           <w:p>
             <w:r/>
@@ -3321,15 +3054,7 @@
         </w:tc>
         <w:tc>
           <w:tcPr>
-            <w:tcW w:type="dxa" w:w="2448"/>
-          </w:tcPr>
-          <w:p>
-            <w:r/>
-          </w:p>
-        </w:tc>
-        <w:tc>
-          <w:tcPr>
-            <w:tcW w:type="dxa" w:w="2448"/>
+            <w:tcW w:type="dxa" w:w="3672"/>
           </w:tcPr>
           <w:p>
             <w:r/>
@@ -3339,11 +3064,11 @@
     </w:tbl>
     <w:p/>
     <w:p>
-      <w:pPr>
-        <w:pStyle w:val="Heading3"/>
-      </w:pPr>
       <w:r>
-        <w:t>Avantages, limites et points à vérifier</w:t>
+        <w:rPr>
+          <w:b/>
+        </w:rPr>
+        <w:t xml:space="preserve">Les points qu'un essai devrait vérifier</w:t>
       </w:r>
     </w:p>
     <w:p>
@@ -3352,7 +3077,7 @@
           <w:i/>
           <w:color w:val="56616C"/>
         </w:rPr>
-        <w:t>Pour ce client-ci : l'effet sur Mélanie, les guides, les clients, le budget, la Loi 25…</w:t>
+        <w:t xml:space="preserve">Ce que la source annonce et que seul un essai pourrait confirmer.</w:t>
       </w:r>
     </w:p>
     <w:p>

</xml_diff>